<commit_message>
minor update and adding screenshot of verification and excel files of CEXs
</commit_message>
<xml_diff>
--- a/Models/Perception/docs/short_summaries/Model contrast.docx
+++ b/Models/Perception/docs/short_summaries/Model contrast.docx
@@ -93,7 +93,7 @@
           <w:rPr>
             <w:rFonts w:ascii="Cambria Math" w:hAnsi="Cambria Math"/>
           </w:rPr>
-          <m:t>≡2</m:t>
+          <m:t>≡</m:t>
         </m:r>
         <m:r>
           <m:rPr>
@@ -109,6 +109,12 @@
             <w:rFonts w:ascii="Cambria Math" w:hAnsi="Cambria Math"/>
           </w:rPr>
           <m:t>L/(</m:t>
+        </m:r>
+        <m:r>
+          <w:rPr>
+            <w:rFonts w:ascii="Cambria Math" w:hAnsi="Cambria Math"/>
+          </w:rPr>
+          <m:t>2</m:t>
         </m:r>
         <m:sSub>
           <m:sSubPr>
@@ -155,6 +161,7 @@
         <w:t xml:space="preserve">Vertical Axis: reaction time in </w:t>
       </w:r>
       <w:proofErr w:type="spellStart"/>
+      <w:proofErr w:type="gramStart"/>
       <w:r>
         <w:t>ms.</w:t>
       </w:r>
@@ -162,6 +169,7 @@
       <w:r>
         <w:t>.</w:t>
       </w:r>
+      <w:proofErr w:type="gramEnd"/>
     </w:p>
     <w:p/>
     <w:p/>
@@ -403,10 +411,18 @@
         <w:t>AGREE</w:t>
       </w:r>
       <w:r>
-        <w:t xml:space="preserve"> model</w:t>
-      </w:r>
-      <w:r>
-        <w:t xml:space="preserve">: encodes </w:t>
+        <w:t xml:space="preserve"> </w:t>
+      </w:r>
+      <w:proofErr w:type="gramStart"/>
+      <w:r>
+        <w:t>model</w:t>
+      </w:r>
+      <w:r>
+        <w:t>:</w:t>
+      </w:r>
+      <w:proofErr w:type="gramEnd"/>
+      <w:r>
+        <w:t xml:space="preserve"> encodes </w:t>
       </w:r>
       <w:r>
         <w:t xml:space="preserve">a discretized version of SP </w:t>
@@ -461,7 +477,15 @@
         <w:t>Spatial frequency: high.</w:t>
       </w:r>
       <w:r>
-        <w:t xml:space="preserve">, Eccentricities: 0 deg i.e. straight on.. </w:t>
+        <w:t xml:space="preserve">, Eccentricities: 0 deg i.e. straight </w:t>
+      </w:r>
+      <w:proofErr w:type="gramStart"/>
+      <w:r>
+        <w:t>on..</w:t>
+      </w:r>
+      <w:proofErr w:type="gramEnd"/>
+      <w:r>
+        <w:t xml:space="preserve"> </w:t>
       </w:r>
     </w:p>
     <w:p/>
@@ -480,7 +504,15 @@
         <w:t xml:space="preserve">operator </w:t>
       </w:r>
       <w:r>
-        <w:t xml:space="preserve">HMD with MR indicating objects in environment with a cross.. </w:t>
+        <w:t xml:space="preserve">HMD with MR indicating objects in environment with a </w:t>
+      </w:r>
+      <w:proofErr w:type="gramStart"/>
+      <w:r>
+        <w:t>cross..</w:t>
+      </w:r>
+      <w:proofErr w:type="gramEnd"/>
+      <w:r>
+        <w:t xml:space="preserve"> </w:t>
       </w:r>
       <w:bookmarkEnd w:id="0"/>
     </w:p>

</xml_diff>

<commit_message>
change light attack to add an effective filter
</commit_message>
<xml_diff>
--- a/Models/Perception/docs/short_summaries/Model contrast.docx
+++ b/Models/Perception/docs/short_summaries/Model contrast.docx
@@ -3,13 +3,8 @@
 <w:document xmlns:wpc="http://schemas.microsoft.com/office/word/2010/wordprocessingCanvas" xmlns:cx="http://schemas.microsoft.com/office/drawing/2014/chartex" xmlns:cx1="http://schemas.microsoft.com/office/drawing/2015/9/8/chartex" xmlns:cx2="http://schemas.microsoft.com/office/drawing/2015/10/21/chartex" xmlns:cx3="http://schemas.microsoft.com/office/drawing/2016/5/9/chartex" xmlns:cx4="http://schemas.microsoft.com/office/drawing/2016/5/10/chartex" xmlns:cx5="http://schemas.microsoft.com/office/drawing/2016/5/11/chartex" xmlns:cx6="http://schemas.microsoft.com/office/drawing/2016/5/12/chartex" xmlns:cx7="http://schemas.microsoft.com/office/drawing/2016/5/13/chartex" xmlns:cx8="http://schemas.microsoft.com/office/drawing/2016/5/14/chartex" xmlns:mc="http://schemas.openxmlformats.org/markup-compatibility/2006" xmlns:aink="http://schemas.microsoft.com/office/drawing/2016/ink" xmlns:am3d="http://schemas.microsoft.com/office/drawing/2017/model3d" xmlns:o="urn:schemas-microsoft-com:office:office" xmlns:oel="http://schemas.microsoft.com/office/2019/extlst" xmlns:r="http://schemas.openxmlformats.org/officeDocument/2006/relationships" xmlns:m="http://schemas.openxmlformats.org/officeDocument/2006/math" xmlns:v="urn:schemas-microsoft-com:vml" xmlns:wp14="http://schemas.microsoft.com/office/word/2010/wordprocessingDrawing" xmlns:wp="http://schemas.openxmlformats.org/drawingml/2006/wordprocessingDrawing" xmlns:w10="urn:schemas-microsoft-com:office:word" xmlns:w="http://schemas.openxmlformats.org/wordprocessingml/2006/main" xmlns:w14="http://schemas.microsoft.com/office/word/2010/wordml" xmlns:w15="http://schemas.microsoft.com/office/word/2012/wordml" xmlns:w16cex="http://schemas.microsoft.com/office/word/2018/wordml/cex" xmlns:w16cid="http://schemas.microsoft.com/office/word/2016/wordml/cid" xmlns:w16="http://schemas.microsoft.com/office/word/2018/wordml" xmlns:w16du="http://schemas.microsoft.com/office/word/2023/wordml/word16du" xmlns:w16sdtdh="http://schemas.microsoft.com/office/word/2020/wordml/sdtdatahash" xmlns:w16sdtfl="http://schemas.microsoft.com/office/word/2024/wordml/sdtformatlock" xmlns:w16se="http://schemas.microsoft.com/office/word/2015/wordml/symex" xmlns:wpg="http://schemas.microsoft.com/office/word/2010/wordprocessingGroup" xmlns:wpi="http://schemas.microsoft.com/office/word/2010/wordprocessingInk" xmlns:wne="http://schemas.microsoft.com/office/word/2006/wordml" xmlns:wps="http://schemas.microsoft.com/office/word/2010/wordprocessingShape" mc:Ignorable="w14 w15 w16se w16cid w16 w16cex w16sdtdh w16sdtfl w16du wp14">
   <w:body>
     <w:p>
-      <w:proofErr w:type="spellStart"/>
-      <w:r>
-        <w:t>Plainis</w:t>
-      </w:r>
-      <w:proofErr w:type="spellEnd"/>
-      <w:r>
-        <w:t>, Sotiris, and I. J. Murray. "Reaction times as an index of visual conspicuity when driving at night." </w:t>
+      <w:r>
+        <w:t>Plainis, Sotiris, and I. J. Murray. "Reaction times as an index of visual conspicuity when driving at night." </w:t>
       </w:r>
       <w:r>
         <w:rPr>
@@ -108,13 +103,7 @@
           <w:rPr>
             <w:rFonts w:ascii="Cambria Math" w:hAnsi="Cambria Math"/>
           </w:rPr>
-          <m:t>L/(</m:t>
-        </m:r>
-        <m:r>
-          <w:rPr>
-            <w:rFonts w:ascii="Cambria Math" w:hAnsi="Cambria Math"/>
-          </w:rPr>
-          <m:t>2</m:t>
+          <m:t>L/(2</m:t>
         </m:r>
         <m:sSub>
           <m:sSubPr>
@@ -158,18 +147,8 @@
     </w:p>
     <w:p>
       <w:r>
-        <w:t xml:space="preserve">Vertical Axis: reaction time in </w:t>
-      </w:r>
-      <w:proofErr w:type="spellStart"/>
-      <w:proofErr w:type="gramStart"/>
-      <w:r>
-        <w:t>ms.</w:t>
-      </w:r>
-      <w:proofErr w:type="spellEnd"/>
-      <w:r>
-        <w:t>.</w:t>
-      </w:r>
-      <w:proofErr w:type="gramEnd"/>
+        <w:t>Vertical Axis: reaction time in ms..</w:t>
+      </w:r>
     </w:p>
     <w:p/>
     <w:p/>
@@ -298,13 +277,8 @@
     </w:p>
     <w:p/>
     <w:p>
-      <w:proofErr w:type="spellStart"/>
-      <w:r>
-        <w:t>Plainis</w:t>
-      </w:r>
-      <w:proofErr w:type="spellEnd"/>
-      <w:r>
-        <w:t xml:space="preserve"> and Murray (2000) derived a similar monotonic</w:t>
+      <w:r>
+        <w:t>Plainis and Murray (2000) derived a similar monotonic</w:t>
       </w:r>
       <w:r>
         <w:t xml:space="preserve"> </w:t>
@@ -411,18 +385,10 @@
         <w:t>AGREE</w:t>
       </w:r>
       <w:r>
-        <w:t xml:space="preserve"> </w:t>
-      </w:r>
-      <w:proofErr w:type="gramStart"/>
-      <w:r>
-        <w:t>model</w:t>
-      </w:r>
-      <w:r>
-        <w:t>:</w:t>
-      </w:r>
-      <w:proofErr w:type="gramEnd"/>
-      <w:r>
-        <w:t xml:space="preserve"> encodes </w:t>
+        <w:t xml:space="preserve"> model</w:t>
+      </w:r>
+      <w:r>
+        <w:t xml:space="preserve">: encodes </w:t>
       </w:r>
       <w:r>
         <w:t xml:space="preserve">a discretized version of SP </w:t>
@@ -437,7 +403,7 @@
         <w:t>luminance</w:t>
       </w:r>
       <w:r>
-        <w:t xml:space="preserve"> of 20 cd/m^2 (circled in red on the figure)</w:t>
+        <w:t xml:space="preserve"> of 2 cd/m^2 (circled in red on the figure)</w:t>
       </w:r>
       <w:r>
         <w:t xml:space="preserve"> for </w:t>
@@ -474,18 +440,7 @@
         <w:t xml:space="preserve"> between 0.1 and 50. </w:t>
       </w:r>
       <w:r>
-        <w:t>Spatial frequency: high.</w:t>
-      </w:r>
-      <w:r>
-        <w:t xml:space="preserve">, Eccentricities: 0 deg i.e. straight </w:t>
-      </w:r>
-      <w:proofErr w:type="gramStart"/>
-      <w:r>
-        <w:t>on..</w:t>
-      </w:r>
-      <w:proofErr w:type="gramEnd"/>
-      <w:r>
-        <w:t xml:space="preserve"> </w:t>
+        <w:t xml:space="preserve">Spatial frequency: high., Eccentricities: 0 deg i.e. straight on.. </w:t>
       </w:r>
     </w:p>
     <w:p/>
@@ -504,15 +459,7 @@
         <w:t xml:space="preserve">operator </w:t>
       </w:r>
       <w:r>
-        <w:t xml:space="preserve">HMD with MR indicating objects in environment with a </w:t>
-      </w:r>
-      <w:proofErr w:type="gramStart"/>
-      <w:r>
-        <w:t>cross..</w:t>
-      </w:r>
-      <w:proofErr w:type="gramEnd"/>
-      <w:r>
-        <w:t xml:space="preserve"> </w:t>
+        <w:t xml:space="preserve">HMD with MR indicating objects in environment with a cross.. </w:t>
       </w:r>
       <w:bookmarkEnd w:id="0"/>
     </w:p>
@@ -1134,6 +1081,7 @@
   <w:style w:type="character" w:default="1" w:styleId="DefaultParagraphFont">
     <w:name w:val="Default Paragraph Font"/>
     <w:uiPriority w:val="1"/>
+    <w:semiHidden/>
     <w:unhideWhenUsed/>
   </w:style>
   <w:style w:type="table" w:default="1" w:styleId="TableNormal">

</xml_diff>